<commit_message>
fix(hackathon): URL repo correcte (gameforge) dans deploy.sh, CDC et prompts
</commit_message>
<xml_diff>
--- a/CDC_GameForge_v2.docx
+++ b/CDC_GameForge_v2.docx
@@ -498,7 +498,7 @@
                 <w:sz w:val="22"/>
                 <w:szCs w:val="22"/>
               </w:rPr>
-              <w:t xml:space="preserve">github.com/Aiglator/eemi-gameforge (branche nexus-engine)</w:t>
+              <w:t xml:space="preserve">github.com/Aiglator/gameforge (branche nexus-engine)</w:t>
             </w:r>
           </w:p>
         </w:tc>
@@ -21042,7 +21042,7 @@
                 <w:sz w:val="18"/>
                 <w:szCs w:val="18"/>
               </w:rPr>
-              <w:t xml:space="preserve">git clone -b nexus-engine https://github.com/Aiglator/eemi-gameforge.git /tmp/app</w:t>
+              <w:t xml:space="preserve">git clone -b nexus-engine https://github.com/Aiglator/gameforge.git /tmp/app</w:t>
             </w:r>
           </w:p>
           <w:p>

</xml_diff>